<commit_message>
docs: bổ sung 2 bước chuyển của RESERVED vào BR-ROOM-02, làm rõ ngữ nghĩa cờ Đã đặ
</commit_message>
<xml_diff>
--- a/docs/TỔNG QUAN DỰ ÁN.docx
+++ b/docs/TỔNG QUAN DỰ ÁN.docx
@@ -3063,7 +3063,7 @@
         <w:rPr>
           <w:rtl w:val="0"/>
         </w:rPr>
-        <w:t xml:space="preserve">Trạng thái phòng gồm 7 trạng thái: Đã đặt, Trống/Sẵn sàng, Đang sử dụng, Chờ dọn, Đang dọn, Chờ kiểm tra, Không khả dụng (gộp Bảo trì + Khóa phòng, kèm lý do).</w:t>
+        <w:t xml:space="preserve">Trạng thái phòng gồm 7 trạng thái: Đã đặt, Trống/Sẵn sàng, Đang sử dụng, Chờ dọn, Đang dọn, Chờ kiểm tra, Không khả dụng (gộp Bảo trì + Khóa phòng, kèm lý do). Trạng thái "Đã đặt" là cờ giữ phòng cho khách sẽ đến TRONG NGÀY, không phải lịch đặt phòng: không lưu ngày đến/đi và không lưu thông tin khách. Do đó Milestone 1 không trả lời được câu hỏi "phòng X ngày Y còn trống không" — việc đó thuộc module Đặt phòng ở milestone sau.</w:t>
       </w:r>
     </w:p>
     <w:p>
@@ -3517,6 +3517,252 @@
                 <w:rtl w:val="0"/>
               </w:rPr>
               <w:t xml:space="preserve">Thủ công, khi khách check-in</w:t>
+            </w:r>
+          </w:p>
+        </w:tc>
+      </w:tr>
+      <w:tr>
+        <w:trPr>
+          <w:cantSplit w:val="0"/>
+          <w:trHeight w:val="720" w:hRule="atLeast"/>
+          <w:tblHeader w:val="0"/>
+        </w:trPr>
+        <w:tc>
+          <w:tcPr>
+            <w:tcBorders>
+              <w:top w:color="000000" w:space="0" w:sz="0" w:val="nil"/>
+              <w:left w:color="000000" w:space="0" w:sz="6" w:val="single"/>
+              <w:bottom w:color="000000" w:space="0" w:sz="6" w:val="single"/>
+              <w:right w:color="000000" w:space="0" w:sz="6" w:val="single"/>
+            </w:tcBorders>
+            <w:shd w:fill="ffffff" w:val="clear"/>
+            <w:tcMar>
+              <w:top w:w="80.0" w:type="dxa"/>
+              <w:left w:w="100.0" w:type="dxa"/>
+              <w:bottom w:w="80.0" w:type="dxa"/>
+              <w:right w:w="100.0" w:type="dxa"/>
+            </w:tcMar>
+            <w:vAlign w:val="top"/>
+          </w:tcPr>
+          <w:p>
+            <w:pPr>
+              <w:rPr/>
+            </w:pPr>
+            <w:r>
+              <w:rPr>
+                <w:rtl w:val="0"/>
+              </w:rPr>
+              <w:t xml:space="preserve">Đã đặt</w:t>
+            </w:r>
+          </w:p>
+        </w:tc>
+        <w:tc>
+          <w:tcPr>
+            <w:tcBorders>
+              <w:top w:color="000000" w:space="0" w:sz="0" w:val="nil"/>
+              <w:left w:color="000000" w:space="0" w:sz="0" w:val="nil"/>
+              <w:bottom w:color="000000" w:space="0" w:sz="6" w:val="single"/>
+              <w:right w:color="000000" w:space="0" w:sz="6" w:val="single"/>
+            </w:tcBorders>
+            <w:shd w:fill="ffffff" w:val="clear"/>
+            <w:tcMar>
+              <w:top w:w="80.0" w:type="dxa"/>
+              <w:left w:w="100.0" w:type="dxa"/>
+              <w:bottom w:w="80.0" w:type="dxa"/>
+              <w:right w:w="100.0" w:type="dxa"/>
+            </w:tcMar>
+            <w:vAlign w:val="top"/>
+          </w:tcPr>
+          <w:p>
+            <w:pPr>
+              <w:rPr/>
+            </w:pPr>
+            <w:r>
+              <w:rPr>
+                <w:rtl w:val="0"/>
+              </w:rPr>
+              <w:t xml:space="preserve">Đang sử dụng</w:t>
+            </w:r>
+          </w:p>
+        </w:tc>
+        <w:tc>
+          <w:tcPr>
+            <w:tcBorders>
+              <w:top w:color="000000" w:space="0" w:sz="0" w:val="nil"/>
+              <w:left w:color="000000" w:space="0" w:sz="0" w:val="nil"/>
+              <w:bottom w:color="000000" w:space="0" w:sz="6" w:val="single"/>
+              <w:right w:color="000000" w:space="0" w:sz="6" w:val="single"/>
+            </w:tcBorders>
+            <w:shd w:fill="ffffff" w:val="clear"/>
+            <w:tcMar>
+              <w:top w:w="80.0" w:type="dxa"/>
+              <w:left w:w="100.0" w:type="dxa"/>
+              <w:bottom w:w="80.0" w:type="dxa"/>
+              <w:right w:w="100.0" w:type="dxa"/>
+            </w:tcMar>
+            <w:vAlign w:val="top"/>
+          </w:tcPr>
+          <w:p>
+            <w:pPr>
+              <w:rPr/>
+            </w:pPr>
+            <w:r>
+              <w:rPr>
+                <w:rtl w:val="0"/>
+              </w:rPr>
+              <w:t xml:space="preserve">Lễ tân</w:t>
+            </w:r>
+          </w:p>
+        </w:tc>
+        <w:tc>
+          <w:tcPr>
+            <w:tcBorders>
+              <w:top w:color="000000" w:space="0" w:sz="0" w:val="nil"/>
+              <w:left w:color="000000" w:space="0" w:sz="0" w:val="nil"/>
+              <w:bottom w:color="000000" w:space="0" w:sz="6" w:val="single"/>
+              <w:right w:color="000000" w:space="0" w:sz="6" w:val="single"/>
+            </w:tcBorders>
+            <w:shd w:fill="ffffff" w:val="clear"/>
+            <w:tcMar>
+              <w:top w:w="80.0" w:type="dxa"/>
+              <w:left w:w="100.0" w:type="dxa"/>
+              <w:bottom w:w="80.0" w:type="dxa"/>
+              <w:right w:w="100.0" w:type="dxa"/>
+            </w:tcMar>
+            <w:vAlign w:val="top"/>
+          </w:tcPr>
+          <w:p>
+            <w:pPr>
+              <w:rPr/>
+            </w:pPr>
+            <w:r>
+              <w:rPr>
+                <w:rtl w:val="0"/>
+              </w:rPr>
+              <w:t xml:space="preserve">Thủ công, khi khách đến nhận phòng</w:t>
+            </w:r>
+          </w:p>
+        </w:tc>
+      </w:tr>
+      <w:tr>
+        <w:trPr>
+          <w:cantSplit w:val="0"/>
+          <w:trHeight w:val="720" w:hRule="atLeast"/>
+          <w:tblHeader w:val="0"/>
+        </w:trPr>
+        <w:tc>
+          <w:tcPr>
+            <w:tcBorders>
+              <w:top w:color="000000" w:space="0" w:sz="0" w:val="nil"/>
+              <w:left w:color="000000" w:space="0" w:sz="6" w:val="single"/>
+              <w:bottom w:color="000000" w:space="0" w:sz="6" w:val="single"/>
+              <w:right w:color="000000" w:space="0" w:sz="6" w:val="single"/>
+            </w:tcBorders>
+            <w:shd w:fill="ffffff" w:val="clear"/>
+            <w:tcMar>
+              <w:top w:w="80.0" w:type="dxa"/>
+              <w:left w:w="100.0" w:type="dxa"/>
+              <w:bottom w:w="80.0" w:type="dxa"/>
+              <w:right w:w="100.0" w:type="dxa"/>
+            </w:tcMar>
+            <w:vAlign w:val="top"/>
+          </w:tcPr>
+          <w:p>
+            <w:pPr>
+              <w:rPr/>
+            </w:pPr>
+            <w:r>
+              <w:rPr>
+                <w:rtl w:val="0"/>
+              </w:rPr>
+              <w:t xml:space="preserve">Đã đặt</w:t>
+            </w:r>
+          </w:p>
+        </w:tc>
+        <w:tc>
+          <w:tcPr>
+            <w:tcBorders>
+              <w:top w:color="000000" w:space="0" w:sz="0" w:val="nil"/>
+              <w:left w:color="000000" w:space="0" w:sz="0" w:val="nil"/>
+              <w:bottom w:color="000000" w:space="0" w:sz="6" w:val="single"/>
+              <w:right w:color="000000" w:space="0" w:sz="6" w:val="single"/>
+            </w:tcBorders>
+            <w:shd w:fill="ffffff" w:val="clear"/>
+            <w:tcMar>
+              <w:top w:w="80.0" w:type="dxa"/>
+              <w:left w:w="100.0" w:type="dxa"/>
+              <w:bottom w:w="80.0" w:type="dxa"/>
+              <w:right w:w="100.0" w:type="dxa"/>
+            </w:tcMar>
+            <w:vAlign w:val="top"/>
+          </w:tcPr>
+          <w:p>
+            <w:pPr>
+              <w:rPr/>
+            </w:pPr>
+            <w:r>
+              <w:rPr>
+                <w:rtl w:val="0"/>
+              </w:rPr>
+              <w:t xml:space="preserve">Trống/Sẵn sàng</w:t>
+            </w:r>
+          </w:p>
+        </w:tc>
+        <w:tc>
+          <w:tcPr>
+            <w:tcBorders>
+              <w:top w:color="000000" w:space="0" w:sz="0" w:val="nil"/>
+              <w:left w:color="000000" w:space="0" w:sz="0" w:val="nil"/>
+              <w:bottom w:color="000000" w:space="0" w:sz="6" w:val="single"/>
+              <w:right w:color="000000" w:space="0" w:sz="6" w:val="single"/>
+            </w:tcBorders>
+            <w:shd w:fill="ffffff" w:val="clear"/>
+            <w:tcMar>
+              <w:top w:w="80.0" w:type="dxa"/>
+              <w:left w:w="100.0" w:type="dxa"/>
+              <w:bottom w:w="80.0" w:type="dxa"/>
+              <w:right w:w="100.0" w:type="dxa"/>
+            </w:tcMar>
+            <w:vAlign w:val="top"/>
+          </w:tcPr>
+          <w:p>
+            <w:pPr>
+              <w:rPr/>
+            </w:pPr>
+            <w:r>
+              <w:rPr>
+                <w:rtl w:val="0"/>
+              </w:rPr>
+              <w:t xml:space="preserve">Lễ tân</w:t>
+            </w:r>
+          </w:p>
+        </w:tc>
+        <w:tc>
+          <w:tcPr>
+            <w:tcBorders>
+              <w:top w:color="000000" w:space="0" w:sz="0" w:val="nil"/>
+              <w:left w:color="000000" w:space="0" w:sz="0" w:val="nil"/>
+              <w:bottom w:color="000000" w:space="0" w:sz="6" w:val="single"/>
+              <w:right w:color="000000" w:space="0" w:sz="6" w:val="single"/>
+            </w:tcBorders>
+            <w:shd w:fill="ffffff" w:val="clear"/>
+            <w:tcMar>
+              <w:top w:w="80.0" w:type="dxa"/>
+              <w:left w:w="100.0" w:type="dxa"/>
+              <w:bottom w:w="80.0" w:type="dxa"/>
+              <w:right w:w="100.0" w:type="dxa"/>
+            </w:tcMar>
+            <w:vAlign w:val="top"/>
+          </w:tcPr>
+          <w:p>
+            <w:pPr>
+              <w:rPr/>
+            </w:pPr>
+            <w:r>
+              <w:rPr>
+                <w:rtl w:val="0"/>
+              </w:rPr>
+              <w:t xml:space="preserve">Thủ công, khi khách hủy đặt hoặc không đến (no-show)</w:t>
             </w:r>
           </w:p>
         </w:tc>

</xml_diff>